<commit_message>
Rewrite proposal in professional voice; cite poster's limitation to justify method choice; fix DAG connector routing
</commit_message>
<xml_diff>
--- a/proposal/Project_Proposal_Muritala.docx
+++ b/proposal/Project_Proposal_Muritala.docx
@@ -30,10 +30,10 @@
           <w:b/>
           <w:bCs/>
           <w:color w:val="1F3864"/>
-          <w:sz w:val="34"/>
-          <w:szCs w:val="34"/>
-        </w:rPr>
-        <w:t xml:space="preserve">Causal Effect of Maternal Smoking During Pregnancy on Preterm Birth: A Propensity-Score Approach</w:t>
+          <w:sz w:val="30"/>
+          <w:szCs w:val="30"/>
+        </w:rPr>
+        <w:t xml:space="preserve">Causal Effect of Maternal Smoking During Pregnancy on Preterm Birth: A Propensity-Score and Doubly Robust (AIPW) Approach</w:t>
       </w:r>
     </w:p>
     <w:p>
@@ -129,21 +129,21 @@
           <w:sz w:val="22"/>
           <w:szCs w:val="22"/>
         </w:rPr>
-        <w:t xml:space="preserve">: it will estimate the causal effect of a modifiable prenatal exposure — maternal smoking during pregnancy — on a major adverse birth outcome — preterm birth — using real-world administrative data and propensity-score adjustment methods.</w:t>
-      </w:r>
-    </w:p>
-    <w:p>
-      <w:pPr>
-        <w:spacing w:after="140" w:line="268"/>
-        <w:jc w:val="both"/>
-      </w:pPr>
-      <w:r>
-        <w:rPr>
-          <w:rFonts w:ascii="Calibri" w:cs="Calibri" w:eastAsia="Calibri" w:hAnsi="Calibri"/>
-          <w:sz w:val="22"/>
-          <w:szCs w:val="22"/>
-        </w:rPr>
-        <w:t xml:space="preserve">The project is motivated by a poster presented at the Joint Statistical Meetings by researchers at Utah Valley University (Heiny &amp; Islam), which applied propensity-score matching to a similar maternal-smoking and preterm-birth question on a smaller, matched sample. This proposal describes a planned extension of that general approach to a much larger and more recent national cohort, with explicit attention to the identifying assumptions, diagnostic checks, and disclosure practices a rigorous causal analysis requires.</w:t>
+        <w:t xml:space="preserve"> that will estimate the causal effect of a modifiable prenatal exposure, maternal smoking during pregnancy, on a major adverse birth outcome, preterm birth, using real-world administrative data and propensity-score adjustment methods.</w:t>
+      </w:r>
+    </w:p>
+    <w:p>
+      <w:pPr>
+        <w:spacing w:after="140" w:line="268"/>
+        <w:jc w:val="both"/>
+      </w:pPr>
+      <w:r>
+        <w:rPr>
+          <w:rFonts w:ascii="Calibri" w:cs="Calibri" w:eastAsia="Calibri" w:hAnsi="Calibri"/>
+          <w:sz w:val="22"/>
+          <w:szCs w:val="22"/>
+        </w:rPr>
+        <w:t xml:space="preserve">The project is motivated by a poster presented at the Joint Statistical Meetings by researchers at Utah Valley University (Heiny &amp; Islam), which applied propensity-score matching to a similar maternal-smoking and preterm-birth question on a comparatively small, individually matched sample. Matching at that scale is well suited to a small cohort, but it does not scale efficiently to a near-census administrative file: exact or nearest-neighbor matching requires a pairwise search over the full control pool for every treated unit, and at a cohort size of several million births, extensive ties in the propensity-score distribution make that search computationally impractical. This proposal extends the general approach of the cited poster to the full 2023 U.S. national birth cohort rather than a matched subsample, and for that reason relies on weighting-based propensity-score methods, specifically inverse-probability-of-treatment weighting and propensity-score-quintile stratification, together with a doubly robust estimator (AIPW), rather than individual-level matching, as the primary strategy for confounding control. This choice, its justification, and its practical implications are detailed further in Section 7.</w:t>
       </w:r>
     </w:p>
     <w:p>
@@ -435,7 +435,7 @@
           <w:sz w:val="22"/>
           <w:szCs w:val="22"/>
         </w:rPr>
-        <w:t xml:space="preserve">, published by the National Center for Health Statistics (NCHS) and distributed by NBER (data.nber.org/nvss/natality/csv/2023/natality2023us.zip). The file is a near-census record of essentially every live birth registered in the United States in 2023 — approximately 3.6 million birth-certificate records — including maternal demographic and socioeconomic fields, prenatal-care and medical-history indicators, self-reported smoking status, and gestational age at delivery.</w:t>
+        <w:t xml:space="preserve">, published by the National Center for Health Statistics (NCHS) and distributed by NBER (data.nber.org/nvss/natality/csv/2023/natality2023us.zip). The file is a near-census record of essentially every live birth registered in the United States in 2023 (approximately 3.6 million birth-certificate records), including maternal demographic and socioeconomic fields, prenatal-care and medical-history indicators, self-reported smoking status, and gestational age at delivery.</w:t>
       </w:r>
     </w:p>
     <w:p>
@@ -667,55 +667,31 @@
           <w:sz w:val="19"/>
           <w:szCs w:val="19"/>
         </w:rPr>
-        <w:t xml:space="preserve">Figure 1. Planned analytic workflow. Each stage is disclosed in the eventual write-up exactly as executed, including the contingency step noted under Stage 5.</w:t>
-      </w:r>
-    </w:p>
-    <w:p>
-      <w:pPr>
-        <w:spacing w:after="200" w:line="268"/>
-        <w:jc w:val="both"/>
-      </w:pPr>
-      <w:r>
-        <w:rPr>
-          <w:rFonts w:ascii="Calibri" w:cs="Calibri" w:eastAsia="Calibri" w:hAnsi="Calibri"/>
-          <w:b/>
-          <w:bCs/>
-          <w:sz w:val="22"/>
-          <w:szCs w:val="22"/>
-        </w:rPr>
-        <w:t xml:space="preserve">Revised following meeting with Dr. Ghosh (Sept. 24, 2026).</w:t>
-      </w:r>
-      <w:r>
-        <w:rPr>
-          <w:rFonts w:ascii="Calibri" w:cs="Calibri" w:eastAsia="Calibri" w:hAnsi="Calibri"/>
-          <w:sz w:val="22"/>
-          <w:szCs w:val="22"/>
-        </w:rPr>
-        <w:t xml:space="preserve"> Two changes below were made directly in response to that meeting, not on the author's own initiative: (1) insurance/payer type was removed from the adjustment set, since it was not defensible as a direct cause of smoking itself (Section 7's node-by-node defense, below); and (2) the doubly-robust estimator is now explicitly named AIPW (augmented inverse-probability weighting) — a method not yet covered in class, added at Dr. Ghosh's specific request as a stronger complement to IPTW.</w:t>
-      </w:r>
-    </w:p>
-    <w:p>
-      <w:pPr>
-        <w:spacing w:after="140" w:line="268"/>
-        <w:jc w:val="both"/>
-      </w:pPr>
-      <w:r>
-        <w:rPr>
-          <w:rFonts w:ascii="Calibri" w:cs="Calibri" w:eastAsia="Calibri" w:hAnsi="Calibri"/>
-          <w:b/>
-          <w:bCs/>
-          <w:sz w:val="22"/>
-          <w:szCs w:val="22"/>
-        </w:rPr>
-        <w:t xml:space="preserve">Stage 1–2: Causal diagram and adjustment set.</w:t>
-      </w:r>
-      <w:r>
-        <w:rPr>
-          <w:rFonts w:ascii="Calibri" w:cs="Calibri" w:eastAsia="Calibri" w:hAnsi="Calibri"/>
-          <w:sz w:val="22"/>
-          <w:szCs w:val="22"/>
-        </w:rPr>
-        <w:t xml:space="preserve"> A directed acyclic graph (DAG) will be drawn to represent the assumed causal structure linking maternal smoking, preterm birth, and their shared causes, and to identify a minimal sufficient adjustment set — the smallest set of pre-treatment variables that blocks every backdoor path between T and Y without conditioning on a mediator or a collider. Following Dr. Ghosh's guidance that every edge into T must be individually defended — not defaulted — rather than assumed from a variable's relevance to Y alone, the planned adjustment set includes ten pre-treatment covariates: maternal age, race/ethnicity, education, prenatal-care onset timing, WIC participation, parity, prior preterm birth, pre-pregnancy diabetes, pre-pregnancy hypertension, and pre-pregnancy BMI. A draft of this diagram is attached as Figure 2a and is also provided as a separate, editable PowerPoint file (native, draggable shapes) so that the adjustment set can be revised jointly with feedback on this proposal.</w:t>
+        <w:t xml:space="preserve">Figure 1. Planned analytic workflow. Each stage will be disclosed in the eventual write-up exactly as executed, including the rationale noted under Stage 7 for reporting AIPW as the primary result.</w:t>
+      </w:r>
+    </w:p>
+    <w:p>
+      <w:pPr>
+        <w:spacing w:after="140" w:line="268"/>
+        <w:jc w:val="both"/>
+      </w:pPr>
+      <w:r>
+        <w:rPr>
+          <w:rFonts w:ascii="Calibri" w:cs="Calibri" w:eastAsia="Calibri" w:hAnsi="Calibri"/>
+          <w:b/>
+          <w:bCs/>
+          <w:sz w:val="22"/>
+          <w:szCs w:val="22"/>
+        </w:rPr>
+        <w:t xml:space="preserve">Stage 1-2: Causal diagram and adjustment set.</w:t>
+      </w:r>
+      <w:r>
+        <w:rPr>
+          <w:rFonts w:ascii="Calibri" w:cs="Calibri" w:eastAsia="Calibri" w:hAnsi="Calibri"/>
+          <w:sz w:val="22"/>
+          <w:szCs w:val="22"/>
+        </w:rPr>
+        <w:t xml:space="preserve"> A directed acyclic graph (DAG) will be drawn to represent the assumed causal structure linking maternal smoking, preterm birth, and their shared causes, and to identify a minimal sufficient adjustment set: the smallest set of pre-treatment variables that blocks every backdoor path between T and Y without conditioning on a mediator or a collider. Every edge into T is defended individually, on the substantive question of whether that variable can plausibly cause smoking, rather than assumed from a variable's relevance to Y alone. On this standard, the adjustment set includes ten pre-treatment covariates: maternal age, race/ethnicity, education, prenatal-care onset timing, WIC participation, parity, prior preterm birth, pre-pregnancy diabetes, pre-pregnancy hypertension, and pre-pregnancy BMI. A draft of this diagram is attached as Figure 2a and is also provided as a separate, editable PowerPoint file (native, draggable shapes) so that the adjustment set can be revised jointly with feedback on this proposal.</w:t>
       </w:r>
     </w:p>
     <w:p>
@@ -833,21 +809,21 @@
           <w:sz w:val="22"/>
           <w:szCs w:val="22"/>
         </w:rPr>
-        <w:t xml:space="preserve"> T → Y — this is the effect being estimated, not blocked;</w:t>
-      </w:r>
-    </w:p>
-    <w:p>
-      <w:pPr>
-        <w:spacing w:after="140" w:line="268"/>
-        <w:jc w:val="both"/>
-      </w:pPr>
-      <w:r>
-        <w:rPr>
-          <w:rFonts w:ascii="Calibri" w:cs="Calibri" w:eastAsia="Calibri" w:hAnsi="Calibri"/>
-          <w:sz w:val="22"/>
-          <w:szCs w:val="22"/>
-        </w:rPr>
-        <w:t xml:space="preserve">(2–11) </w:t>
+        <w:t xml:space="preserve"> T → Y: this is the effect being estimated, not blocked;</w:t>
+      </w:r>
+    </w:p>
+    <w:p>
+      <w:pPr>
+        <w:spacing w:after="140" w:line="268"/>
+        <w:jc w:val="both"/>
+      </w:pPr>
+      <w:r>
+        <w:rPr>
+          <w:rFonts w:ascii="Calibri" w:cs="Calibri" w:eastAsia="Calibri" w:hAnsi="Calibri"/>
+          <w:sz w:val="22"/>
+          <w:szCs w:val="22"/>
+        </w:rPr>
+        <w:t xml:space="preserve">(2-11) </w:t>
       </w:r>
       <w:r>
         <w:rPr>
@@ -925,7 +901,7 @@
           <w:sz w:val="22"/>
           <w:szCs w:val="22"/>
         </w:rPr>
-        <w:t xml:space="preserve">: no variable can be removed from it — each confounder is the only node on its own backdoor path, so dropping it would leave that specific path unblocked (open), and Z contains no mediator or collider of T → Y that would need to be excluded. This is the formal justification for the propensity-score model's covariate list in Stage 3.</w:t>
+        <w:t xml:space="preserve">: no variable can be removed from it, since each confounder is the only node on its own backdoor path, so dropping it would leave that specific path unblocked (open); Z also contains no mediator or collider of T → Y that would need to be excluded. This is the formal justification for the propensity-score model's covariate list in Stage 3.</w:t>
       </w:r>
     </w:p>
     <w:p>
@@ -949,49 +925,49 @@
           <w:sz w:val="22"/>
           <w:szCs w:val="22"/>
         </w:rPr>
-        <w:t xml:space="preserve"> Per Dr. Ghosh's instruction — "ask yourself whether this can cause smoking or not; if not, no causal edge; if yes, there is a causal edge" — each candidate variable was evaluated individually against smoking specifically, not just against preterm birth:</w:t>
-      </w:r>
-    </w:p>
-    <w:p>
-      <w:pPr>
-        <w:spacing w:after="140" w:line="268"/>
-        <w:jc w:val="both"/>
-      </w:pPr>
-      <w:r>
-        <w:rPr>
-          <w:rFonts w:ascii="Calibri" w:cs="Calibri" w:eastAsia="Calibri" w:hAnsi="Calibri"/>
-          <w:sz w:val="22"/>
-          <w:szCs w:val="22"/>
-        </w:rPr>
-        <w:t xml:space="preserve">Education → T: kept. Lower educational attainment plausibly increases smoking via socioeconomic pathways (health literacy, income, workplace/social norms) that precede and are largely independent of the pregnancy itself. This is also the strongest empirical correlate of smoking status among all candidate covariates in the 2023 extract (r = −0.128, coded so that higher educational attainment associates with lower smoking prevalence).</w:t>
-      </w:r>
-    </w:p>
-    <w:p>
-      <w:pPr>
-        <w:spacing w:after="140" w:line="268"/>
-        <w:jc w:val="both"/>
-      </w:pPr>
-      <w:r>
-        <w:rPr>
-          <w:rFonts w:ascii="Calibri" w:cs="Calibri" w:eastAsia="Calibri" w:hAnsi="Calibri"/>
-          <w:sz w:val="22"/>
-          <w:szCs w:val="22"/>
-        </w:rPr>
-        <w:t xml:space="preserve">Maternal age, race/ethnicity, WIC participation, parity, prior preterm birth, pre-pregnancy diabetes, pre-pregnancy hypertension, pre-pregnancy BMI, prenatal-care timing → T: kept. Each plausibly precedes and shapes smoking behavior or reflects a shared upstream cause with it (e.g., WIC participation and parity both proxy socioeconomic circumstances that influence smoking uptake and cessation); none is a consequence of the smoking decision itself.</w:t>
-      </w:r>
-    </w:p>
-    <w:p>
-      <w:pPr>
-        <w:spacing w:after="140" w:line="268"/>
-        <w:jc w:val="both"/>
-      </w:pPr>
-      <w:r>
-        <w:rPr>
-          <w:rFonts w:ascii="Calibri" w:cs="Calibri" w:eastAsia="Calibri" w:hAnsi="Calibri"/>
-          <w:sz w:val="22"/>
-          <w:szCs w:val="22"/>
-        </w:rPr>
-        <w:t xml:space="preserve">Insurance/payer type → T: excluded. Per Dr. Ghosh's own illustrative example in the Sept. 24 meeting, insurance/payer type is not a plausible direct cause of smoking — it does not causally precede or determine whether a mother smokes. This is a genuine judgment call worth stating plainly: pay_rec is, in fact, correlated with smoking status in the 2023 extract (r = −0.100, comparable in magnitude to several retained covariates), but the more defensible reading is that this correlation is confounded by socioeconomic status rather than causal — the same underlying SES gradient that drives the education→smoking pathway also happens to sort mothers into insurance categories. Because education is already in the adjustment set, this shared SES pathway is still addressed; adding insurance itself would risk conditioning on a variable whose relationship to T runs through a common cause rather than a direct edge, without a correspondingly clear identification benefit, and at some cost to the positivity assumption Dr. Ghosh flagged ("the more variables you take, the more positivity will get violated").</w:t>
+        <w:t xml:space="preserve"> The standard applied to every candidate covariate is whether it plausibly causes smoking specifically, not merely whether it is associated with preterm birth. For each variable, the question is whether it can plausibly cause smoking: if not, no causal edge into T is drawn; if so, the edge is retained. Each candidate variable was evaluated individually against smoking, not just against preterm birth:</w:t>
+      </w:r>
+    </w:p>
+    <w:p>
+      <w:pPr>
+        <w:spacing w:after="140" w:line="268"/>
+        <w:jc w:val="both"/>
+      </w:pPr>
+      <w:r>
+        <w:rPr>
+          <w:rFonts w:ascii="Calibri" w:cs="Calibri" w:eastAsia="Calibri" w:hAnsi="Calibri"/>
+          <w:sz w:val="22"/>
+          <w:szCs w:val="22"/>
+        </w:rPr>
+        <w:t xml:space="preserve">Education → T: kept. Lower educational attainment plausibly increases smoking via socioeconomic pathways (health literacy, income, workplace and social norms) that precede and are largely independent of the pregnancy itself. This is also the strongest empirical correlate of smoking status among all candidate covariates in the 2023 extract (r = −0.128, coded so that higher educational attainment associates with lower smoking prevalence).</w:t>
+      </w:r>
+    </w:p>
+    <w:p>
+      <w:pPr>
+        <w:spacing w:after="140" w:line="268"/>
+        <w:jc w:val="both"/>
+      </w:pPr>
+      <w:r>
+        <w:rPr>
+          <w:rFonts w:ascii="Calibri" w:cs="Calibri" w:eastAsia="Calibri" w:hAnsi="Calibri"/>
+          <w:sz w:val="22"/>
+          <w:szCs w:val="22"/>
+        </w:rPr>
+        <w:t xml:space="preserve">Maternal age, race/ethnicity, WIC participation, parity, prior preterm birth, pre-pregnancy diabetes, pre-pregnancy hypertension, pre-pregnancy BMI, prenatal-care timing → T: kept. Each plausibly precedes and shapes smoking behavior or reflects a shared upstream cause with it (for example, WIC participation and parity both proxy socioeconomic circumstances that influence smoking uptake and cessation); none is a consequence of the smoking decision itself.</w:t>
+      </w:r>
+    </w:p>
+    <w:p>
+      <w:pPr>
+        <w:spacing w:after="140" w:line="268"/>
+        <w:jc w:val="both"/>
+      </w:pPr>
+      <w:r>
+        <w:rPr>
+          <w:rFonts w:ascii="Calibri" w:cs="Calibri" w:eastAsia="Calibri" w:hAnsi="Calibri"/>
+          <w:sz w:val="22"/>
+          <w:szCs w:val="22"/>
+        </w:rPr>
+        <w:t xml:space="preserve">Insurance/payer type → T: excluded. Insurance or payer type is not a plausible direct cause of smoking: it does not causally precede or determine whether a mother smokes. This exclusion is a genuine judgment call worth stating plainly. pay_rec is, in fact, correlated with smoking status in the 2023 extract (r = −0.100, comparable in magnitude to several retained covariates), but the more defensible reading is that this correlation reflects confounding by socioeconomic status rather than a direct causal relationship: the same underlying socioeconomic gradient that drives the education-to-smoking pathway also appears to sort mothers into insurance categories. Because education is already included in the adjustment set, this shared socioeconomic pathway is still addressed. Adding insurance itself would risk conditioning on a variable whose relationship to T runs through a common cause rather than a direct edge, without a corresponding identification benefit, and at some cost to the positivity assumption, since including additional weakly justified covariates increases the risk that some covariate strata contain few or no treated or untreated units.</w:t>
       </w:r>
     </w:p>
     <w:p>
@@ -1015,7 +991,7 @@
           <w:sz w:val="22"/>
           <w:szCs w:val="22"/>
         </w:rPr>
-        <w:t xml:space="preserve"> The ten confounders are not assumed to be causally unrelated to one another — for example, maternal age plausibly influences parity, and education plausibly influences WIC participation. Figure 2b, attached separately, sketches one plausible ordering among them for illustration. This ordering does </w:t>
+        <w:t xml:space="preserve"> The ten confounders are not assumed to be causally unrelated to one another. For example, maternal age plausibly influences parity, and education plausibly influences WIC participation. Figure 2b, attached separately, sketches one plausible ordering among them for illustration. This ordering does </w:t>
       </w:r>
       <w:r>
         <w:rPr>
@@ -1033,7 +1009,7 @@
           <w:sz w:val="22"/>
           <w:szCs w:val="22"/>
         </w:rPr>
-        <w:t xml:space="preserve"> change the argument above: because every confounder is a direct parent of both T and Y (Figure 2a), conditioning on each one individually blocks every path that runs through it, including any longer path that happens to pass through other confounders first — a standard consequence of d-separation (conditioning on a non-collider blocks every path through that node). No separate accounting of paths through the confounders' internal structure is required.</w:t>
+        <w:t xml:space="preserve"> change the argument above: because every confounder is a direct parent of both T and Y (Figure 2a), conditioning on each one individually blocks every path that runs through it, including any longer path that happens to pass through other confounders first, a standard consequence of d-separation (conditioning on a non-collider blocks every path through that node). No separate accounting of paths through the confounders' internal structure is required.</w:t>
       </w:r>
     </w:p>
     <w:p>
@@ -1095,23 +1071,23 @@
           <w:sz w:val="19"/>
           <w:szCs w:val="19"/>
         </w:rPr>
-        <w:t xml:space="preserve">Figure 2b (supplementary, not required for identification). One plausible ordering among the ten confounders, shown separately from Figure 2a to keep each diagram readable. Steel-blue dashed arrows are an assumed temporal/conceptual ordering, not an estimated association. The solid orange arrow (Education → T) is included deliberately, per Dr. Ghosh's feedback, to keep the edge into exposure visible alongside the confounders' own structure; it is not a new, 12th path — it is path (2) from Figure 2a. An editable PowerPoint with both diagrams is attached separately.</w:t>
-      </w:r>
-    </w:p>
-    <w:p>
-      <w:pPr>
-        <w:spacing w:after="140" w:line="268"/>
-        <w:jc w:val="both"/>
-      </w:pPr>
-      <w:r>
-        <w:rPr>
-          <w:rFonts w:ascii="Calibri" w:cs="Calibri" w:eastAsia="Calibri" w:hAnsi="Calibri"/>
-          <w:b/>
-          <w:bCs/>
-          <w:sz w:val="22"/>
-          <w:szCs w:val="22"/>
-        </w:rPr>
-        <w:t xml:space="preserve">Stage 3–4: Propensity-score model and positivity.</w:t>
+        <w:t xml:space="preserve">Figure 2b (supplementary, not required for identification). One plausible ordering among the ten confounders, shown separately from Figure 2a to keep each diagram readable. Steel-blue dashed arrows are an assumed temporal/conceptual ordering, not an estimated association. The solid orange arrow (Education → T) is included deliberately, to keep the edge into exposure visible alongside the confounders' own structure. It is not a new, twelfth path: it corresponds to path (2) from Figure 2a. An editable PowerPoint with both diagrams is attached separately.</w:t>
+      </w:r>
+    </w:p>
+    <w:p>
+      <w:pPr>
+        <w:spacing w:after="140" w:line="268"/>
+        <w:jc w:val="both"/>
+      </w:pPr>
+      <w:r>
+        <w:rPr>
+          <w:rFonts w:ascii="Calibri" w:cs="Calibri" w:eastAsia="Calibri" w:hAnsi="Calibri"/>
+          <w:b/>
+          <w:bCs/>
+          <w:sz w:val="22"/>
+          <w:szCs w:val="22"/>
+        </w:rPr>
+        <w:t xml:space="preserve">Stage 3-4: Propensity-score model and positivity.</w:t>
       </w:r>
       <w:r>
         <w:rPr>
@@ -1135,15 +1111,15 @@
           <w:sz w:val="22"/>
           <w:szCs w:val="22"/>
         </w:rPr>
-        <w:t xml:space="preserve">Stage 5: Weighting and/or stratification.</w:t>
-      </w:r>
-      <w:r>
-        <w:rPr>
-          <w:rFonts w:ascii="Calibri" w:cs="Calibri" w:eastAsia="Calibri" w:hAnsi="Calibri"/>
-          <w:sz w:val="22"/>
-          <w:szCs w:val="22"/>
-        </w:rPr>
-        <w:t xml:space="preserve"> The primary planned estimator is stabilized inverse-probability-of-treatment weighting (IPTW). As sensitivity analyses, propensity-score-quintile stratification (with Mantel–Haenszel pooling across strata) and 1:1 nearest-neighbor PS matching — the method used in the study this project extends — will also be attempted. Because the analytic cohort is large, 1:1 matching may prove computationally infeasible; if so, this will be reported transparently rather than omitted, and the weighting- and stratification-based estimates will serve as the primary results.</w:t>
+        <w:t xml:space="preserve">Stage 5: Weighting and stratification, in place of individual matching.</w:t>
+      </w:r>
+      <w:r>
+        <w:rPr>
+          <w:rFonts w:ascii="Calibri" w:cs="Calibri" w:eastAsia="Calibri" w:hAnsi="Calibri"/>
+          <w:sz w:val="22"/>
+          <w:szCs w:val="22"/>
+        </w:rPr>
+        <w:t xml:space="preserve"> As explained in Section 1, individual-level 1:1 propensity-score matching does not scale to a cohort of this size, so the primary confounding-control strategy uses weighting-based methods instead. Stabilized inverse-probability-of-treatment weighting (IPTW) is the primary estimator, with propensity-score-quintile stratification (Mantel-Haenszel pooling across strata) reported as a secondary check. Both assign each unit a closed-form function of its own propensity score, so neither requires the pairwise search over the control pool that makes matching impractical at this scale.</w:t>
       </w:r>
     </w:p>
     <w:p>
@@ -1183,33 +1159,15 @@
           <w:sz w:val="22"/>
           <w:szCs w:val="22"/>
         </w:rPr>
-        <w:t xml:space="preserve">Stage 7: Effect estimation, including AIPW.</w:t>
-      </w:r>
-      <w:r>
-        <w:rPr>
-          <w:rFonts w:ascii="Calibri" w:cs="Calibri" w:eastAsia="Calibri" w:hAnsi="Calibri"/>
-          <w:sz w:val="22"/>
-          <w:szCs w:val="22"/>
-        </w:rPr>
-        <w:t xml:space="preserve"> IPTW alone is not doubly robust: it is consistent only if the propensity-score model is correctly specified. Per Dr. Ghosh's guidance, the plan therefore adds </w:t>
-      </w:r>
-      <w:r>
-        <w:rPr>
-          <w:rFonts w:ascii="Calibri" w:cs="Calibri" w:eastAsia="Calibri" w:hAnsi="Calibri"/>
-          <w:b/>
-          <w:bCs/>
-          <w:sz w:val="22"/>
-          <w:szCs w:val="22"/>
-        </w:rPr>
-        <w:t xml:space="preserve">augmented inverse-probability weighting (AIPW)</w:t>
-      </w:r>
-      <w:r>
-        <w:rPr>
-          <w:rFonts w:ascii="Calibri" w:cs="Calibri" w:eastAsia="Calibri" w:hAnsi="Calibri"/>
-          <w:sz w:val="22"/>
-          <w:szCs w:val="22"/>
-        </w:rPr>
-        <w:t xml:space="preserve"> — a method the course has not yet covered — as the primary doubly-robust estimator, combining the propensity-score model with an outcome regression so that the estimate remains consistent if </w:t>
+        <w:t xml:space="preserve">Stage 7: Effect estimation via a doubly robust estimator (AIPW).</w:t>
+      </w:r>
+      <w:r>
+        <w:rPr>
+          <w:rFonts w:ascii="Calibri" w:cs="Calibri" w:eastAsia="Calibri" w:hAnsi="Calibri"/>
+          <w:sz w:val="22"/>
+          <w:szCs w:val="22"/>
+        </w:rPr>
+        <w:t xml:space="preserve"> A weighting-based estimator such as IPTW is consistent only if the propensity-score model is correctly specified, a condition that cannot be guaranteed in practice. The estimation plan therefore also includes augmented inverse-probability weighting (AIPW), a doubly robust estimator that combines the propensity-score model with an outcome regression so that the treatment-effect estimate remains consistent if </w:t>
       </w:r>
       <w:r>
         <w:rPr>
@@ -1227,7 +1185,7 @@
           <w:sz w:val="22"/>
           <w:szCs w:val="22"/>
         </w:rPr>
-        <w:t xml:space="preserve"> model (not necessarily both) is correctly specified. All estimators (crude, DAG-adjusted regression, IPTW, AIPW, and PS-quintile stratification) will be reported as an odds ratio (primary) and a risk difference (secondary), each with a robust (sandwich) variance estimator and a 95% confidence interval.</w:t>
+        <w:t xml:space="preserve"> model, not necessarily both, is correctly specified. AIPW is reported as the primary doubly robust result, with the crude comparison, DAG-adjusted regression, IPTW, and PS-quintile stratification reported alongside it to show a transparent progression from an unadjusted comparison to a fully specified doubly robust estimate. All estimators are reported as an odds ratio (primary) and a risk difference (secondary), each with a robust (sandwich) variance estimator and a 95% confidence interval.</w:t>
       </w:r>
     </w:p>
     <w:p>
@@ -1275,7 +1233,7 @@
           <w:sz w:val="22"/>
           <w:szCs w:val="22"/>
         </w:rPr>
-        <w:t xml:space="preserve"> The causal interpretation of the ATE rests on four standard assumptions, each of which will be stated explicitly and, where testable, checked in the eventual analysis: (1) conditional exchangeability — no unmeasured confounding once the DAG-identified adjustment set is controlled for; (2) positivity — every covariate stratum has a nonzero probability of both smoking and non-smoking, checked via the overlap diagnostic in Stage 4; (3) consistency — the smoking status recorded on the birth certificate corresponds to a well-defined exposure; and (4) SUTVA — one mother's smoking status does not affect another mother's outcome. Self-reported exposure and the binary (any/none) coding of smoking are acknowledged in advance as sources of possible residual bias, to be discussed candidly in the final report.</w:t>
+        <w:t xml:space="preserve"> The causal interpretation of the ATE rests on four standard assumptions, each of which will be stated explicitly and, where testable, checked in the eventual analysis: (1) conditional exchangeability: no unmeasured confounding once the DAG-identified adjustment set is controlled for; (2) positivity: every covariate stratum has a nonzero probability of both smoking and non-smoking, checked via the overlap diagnostic in Stage 4; (3) consistency: the smoking status recorded on the birth certificate corresponds to a well-defined exposure; and (4) SUTVA: one mother's smoking status does not affect another mother's outcome. Self-reported exposure and the binary (any/none) coding of smoking are acknowledged in advance as sources of possible residual bias, to be discussed candidly in the final report.</w:t>
       </w:r>
     </w:p>
     <w:p>

</xml_diff>

<commit_message>
Correct estimator terminology to AIPTW (Augmented IPTW) per instructor's own wording
</commit_message>
<xml_diff>
--- a/proposal/Project_Proposal_Muritala.docx
+++ b/proposal/Project_Proposal_Muritala.docx
@@ -33,7 +33,7 @@
           <w:sz w:val="30"/>
           <w:szCs w:val="30"/>
         </w:rPr>
-        <w:t xml:space="preserve">Causal Effect of Maternal Smoking During Pregnancy on Preterm Birth: A Propensity-Score and Doubly Robust (AIPW) Approach</w:t>
+        <w:t xml:space="preserve">Causal Effect of Maternal Smoking During Pregnancy on Preterm Birth: A Propensity-Score and Doubly Robust (AIPTW) Approach</w:t>
       </w:r>
     </w:p>
     <w:p>
@@ -143,7 +143,7 @@
           <w:sz w:val="22"/>
           <w:szCs w:val="22"/>
         </w:rPr>
-        <w:t xml:space="preserve">The project is motivated by a poster presented at the Joint Statistical Meetings by researchers at Utah Valley University (Heiny &amp; Islam), which applied propensity-score matching to a similar maternal-smoking and preterm-birth question on a comparatively small, individually matched sample. Matching at that scale is well suited to a small cohort, but it does not scale efficiently to a near-census administrative file: exact or nearest-neighbor matching requires a pairwise search over the full control pool for every treated unit, and at a cohort size of several million births, extensive ties in the propensity-score distribution make that search computationally impractical. This proposal extends the general approach of the cited poster to the full 2023 U.S. national birth cohort rather than a matched subsample, and for that reason relies on weighting-based propensity-score methods, specifically inverse-probability-of-treatment weighting and propensity-score-quintile stratification, together with a doubly robust estimator (AIPW), rather than individual-level matching, as the primary strategy for confounding control. This choice, its justification, and its practical implications are detailed further in Section 7.</w:t>
+        <w:t xml:space="preserve">The project is motivated by a poster presented at the Joint Statistical Meetings by researchers at Utah Valley University (Heiny &amp; Islam), which applied propensity-score matching to a similar maternal-smoking and preterm-birth question on a comparatively small, individually matched sample. Matching at that scale is well suited to a small cohort, but it does not scale efficiently to a near-census administrative file: exact or nearest-neighbor matching requires a pairwise search over the full control pool for every treated unit, and at a cohort size of several million births, extensive ties in the propensity-score distribution make that search computationally impractical. This proposal extends the general approach of the cited poster to the full 2023 U.S. national birth cohort rather than a matched subsample, and for that reason relies on weighting-based propensity-score methods, specifically inverse-probability-of-treatment weighting and propensity-score-quintile stratification, together with a doubly robust estimator (AIPTW), rather than individual-level matching, as the primary strategy for confounding control. This choice, its justification, and its practical implications are detailed further in Section 7.</w:t>
       </w:r>
     </w:p>
     <w:p>
@@ -667,7 +667,7 @@
           <w:sz w:val="19"/>
           <w:szCs w:val="19"/>
         </w:rPr>
-        <w:t xml:space="preserve">Figure 1. Planned analytic workflow. Each stage will be disclosed in the eventual write-up exactly as executed, including the rationale noted under Stage 7 for reporting AIPW as the primary result.</w:t>
+        <w:t xml:space="preserve">Figure 1. Planned analytic workflow. Each stage will be disclosed in the eventual write-up exactly as executed, including the rationale noted under Stage 7 for reporting AIPTW as the primary result.</w:t>
       </w:r>
     </w:p>
     <w:p>
@@ -1159,15 +1159,15 @@
           <w:sz w:val="22"/>
           <w:szCs w:val="22"/>
         </w:rPr>
-        <w:t xml:space="preserve">Stage 7: Effect estimation via a doubly robust estimator (AIPW).</w:t>
-      </w:r>
-      <w:r>
-        <w:rPr>
-          <w:rFonts w:ascii="Calibri" w:cs="Calibri" w:eastAsia="Calibri" w:hAnsi="Calibri"/>
-          <w:sz w:val="22"/>
-          <w:szCs w:val="22"/>
-        </w:rPr>
-        <w:t xml:space="preserve"> A weighting-based estimator such as IPTW is consistent only if the propensity-score model is correctly specified, a condition that cannot be guaranteed in practice. The estimation plan therefore also includes augmented inverse-probability weighting (AIPW), a doubly robust estimator that combines the propensity-score model with an outcome regression so that the treatment-effect estimate remains consistent if </w:t>
+        <w:t xml:space="preserve">Stage 7: Effect estimation via a doubly robust estimator (AIPTW).</w:t>
+      </w:r>
+      <w:r>
+        <w:rPr>
+          <w:rFonts w:ascii="Calibri" w:cs="Calibri" w:eastAsia="Calibri" w:hAnsi="Calibri"/>
+          <w:sz w:val="22"/>
+          <w:szCs w:val="22"/>
+        </w:rPr>
+        <w:t xml:space="preserve"> A weighting-based estimator such as IPTW is consistent only if the propensity-score model is correctly specified, a condition that cannot be guaranteed in practice. The estimation plan therefore also includes augmented inverse probability of treatment weighting (AIPTW), a doubly robust estimator that combines the propensity-score model with an outcome regression so that the treatment-effect estimate remains consistent if </w:t>
       </w:r>
       <w:r>
         <w:rPr>
@@ -1185,7 +1185,7 @@
           <w:sz w:val="22"/>
           <w:szCs w:val="22"/>
         </w:rPr>
-        <w:t xml:space="preserve"> model, not necessarily both, is correctly specified. AIPW is reported as the primary doubly robust result, with the crude comparison, DAG-adjusted regression, IPTW, and PS-quintile stratification reported alongside it to show a transparent progression from an unadjusted comparison to a fully specified doubly robust estimate. All estimators are reported as an odds ratio (primary) and a risk difference (secondary), each with a robust (sandwich) variance estimator and a 95% confidence interval.</w:t>
+        <w:t xml:space="preserve"> model, not necessarily both, is correctly specified. AIPTW is reported as the primary doubly robust result, with the crude comparison, DAG-adjusted regression, IPTW, and PS-quintile stratification reported alongside it to show a transparent progression from an unadjusted comparison to a fully specified doubly robust estimate. All estimators are reported as an odds ratio (primary) and a risk difference (secondary), each with a robust (sandwich) variance estimator and a 95% confidence interval.</w:t>
       </w:r>
     </w:p>
     <w:p>

</xml_diff>